<commit_message>
Verbs: Essential / Important / Useful tiers for French Quizlet (40/30/30), Italian IGCSE (46/35/34) and Spanish F Block (28/22/21) verbs; chips in drill, tests, Speed Challenge; View & Print badges and Group by Tier; Spanish list now shows all 71 F Block verbs; guides updated
Co-Authored-By: Claude Sonnet 5.5 <noreply@anthropic.com>
Claude-Session: https://claude.ai/code/session_01PyR4m9qw3VZiECsMbL7sBu
</commit_message>
<xml_diff>
--- a/Word documents/Eton_F_Block_Spanish_Start_Here.docx
+++ b/Word documents/Eton_F_Block_Spanish_Start_Here.docx
@@ -938,6 +938,50 @@
         <w:spacing w:after="60" w:line="276"/>
       </w:pPr>
       <w:r>
+        <w:rPr/>
+        <w:t xml:space="preserve">Leave </w:t>
+      </w:r>
+      <w:r>
+        <w:rPr>
+          <w:b/>
+        </w:rPr>
+        <w:t>Importance</w:t>
+      </w:r>
+      <w:r>
+        <w:rPr/>
+        <w:t xml:space="preserve"> on </w:t>
+      </w:r>
+      <w:r>
+        <w:rPr>
+          <w:b/>
+        </w:rPr>
+        <w:t>All verbs</w:t>
+      </w:r>
+      <w:r>
+        <w:rPr/>
+        <w:t xml:space="preserve"> unless your teacher says otherwise. </w:t>
+      </w:r>
+      <w:r>
+        <w:rPr>
+          <w:b/>
+        </w:rPr>
+        <w:t>Essential</w:t>
+      </w:r>
+      <w:r>
+        <w:rPr/>
+        <w:t xml:space="preserve"> is the verbs to learn first.</w:t>
+      </w:r>
+    </w:p>
+    <w:p>
+      <w:pPr>
+        <w:pStyle w:val="ListParagraph"/>
+        <w:numPr>
+          <w:ilvl w:val="0"/>
+          <w:numId w:val="3"/>
+        </w:numPr>
+        <w:spacing w:after="60" w:line="276"/>
+      </w:pPr>
+      <w:r>
         <w:rPr>
           <w:rFonts w:ascii="Arial" w:cs="Arial" w:eastAsia="Arial" w:hAnsi="Arial"/>
           <w:sz w:val="22"/>

</xml_diff>